<commit_message>
Update docx and pdf file
</commit_message>
<xml_diff>
--- a/524H0134_524H0017.docx
+++ b/524H0134_524H0017.docx
@@ -1764,7 +1764,21 @@
           <w:sz w:val="26"/>
           <w:szCs w:val="26"/>
         </w:rPr>
-        <w:t>We hereby declare that this is our own project and is guided by Mr. Trinh Hung Cuong; The content research and results contained herein are central and have not been published in any form before. The data in the tables for analysis, comments and evaluation are collected by the main author from different sources, which are clearly stated in the reference section.</w:t>
+        <w:t xml:space="preserve">We hereby declare that this is our own project and is guided by Mr. </w:t>
+      </w:r>
+      <w:r>
+        <w:rPr>
+          <w:sz w:val="26"/>
+          <w:szCs w:val="26"/>
+        </w:rPr>
+        <w:t>Le Van Vang</w:t>
+      </w:r>
+      <w:r>
+        <w:rPr>
+          <w:sz w:val="26"/>
+          <w:szCs w:val="26"/>
+        </w:rPr>
+        <w:t>; The content research and results contained herein are central and have not been published in any form before. The data in the tables for analysis, comments and evaluation are collected by the main author from different sources, which are clearly stated in the reference section.</w:t>
       </w:r>
     </w:p>
     <w:p>
@@ -4835,8 +4849,8 @@
         <w:ind w:firstLine="284"/>
       </w:pPr>
     </w:p>
-    <w:bookmarkStart w:id="21" w:name="_Toc229593558" w:displacedByCustomXml="next"/>
-    <w:bookmarkStart w:id="22" w:name="_Toc152077862" w:displacedByCustomXml="next"/>
+    <w:bookmarkStart w:id="21" w:name="_Toc152077862" w:displacedByCustomXml="next"/>
+    <w:bookmarkStart w:id="22" w:name="_Toc229593558" w:displacedByCustomXml="next"/>
     <w:sdt>
       <w:sdtPr>
         <w:rPr>

</xml_diff>